<commit_message>
Updated 2.4 of srd
</commit_message>
<xml_diff>
--- a/Term1A/SRD report/drafts/russell/PixelPals_SRD_Chamabe_v1.docx
+++ b/Term1A/SRD report/drafts/russell/PixelPals_SRD_Chamabe_v1.docx
@@ -3018,68 +3018,6 @@
       <w:bookmarkEnd w:id="8"/>
     </w:p>
     <w:p>
-      <w:r>
-        <w:rPr>
-          <w:i/>
-          <w:iCs/>
-        </w:rPr>
-        <w:t>List programming languages, frameworks, and tools used.</w:t>
-      </w:r>
-    </w:p>
-    <w:p>
-      <w:r>
-        <w:pict w14:anchorId="6EDA766F">
-          <v:rect id="_x0000_i1028" style="width:0;height:1.5pt" o:hralign="center" o:hrstd="t" o:hr="t" fillcolor="#a0a0a0" stroked="f"/>
-        </w:pict>
-      </w:r>
-    </w:p>
-    <w:p>
-      <w:pPr>
-        <w:pStyle w:val="Heading1"/>
-      </w:pPr>
-      <w:bookmarkStart w:id="9" w:name="_Toc212025826"/>
-      <w:r>
-        <w:t>3. Functional Requirements</w:t>
-      </w:r>
-      <w:bookmarkEnd w:id="9"/>
-    </w:p>
-    <w:p>
-      <w:pPr>
-        <w:pStyle w:val="Heading2"/>
-      </w:pPr>
-      <w:bookmarkStart w:id="10" w:name="_Toc212025827"/>
-      <w:r>
-        <w:t>3.1 Introduction</w:t>
-      </w:r>
-      <w:bookmarkEnd w:id="10"/>
-    </w:p>
-    <w:p>
-      <w:r>
-        <w:t xml:space="preserve">Functional Requirements is based on what the system should do, This can done by the usage of features, specific actions, and behaviours so that it helps the user throughout the website. For the </w:t>
-      </w:r>
-      <w:proofErr w:type="spellStart"/>
-      <w:r>
-        <w:t>PixelPals</w:t>
-      </w:r>
-      <w:proofErr w:type="spellEnd"/>
-      <w:r>
-        <w:t xml:space="preserve"> Project, Function Requirements will make sure that system functionally will allow the users to register, sign in, placing orders and adding Parent control. Furthermore, Function Requirements will support both users and admins by providing features to manage and interact with the ecommerce website with ease .</w:t>
-      </w:r>
-    </w:p>
-    <w:p>
-      <w:pPr>
-        <w:pStyle w:val="Heading2"/>
-      </w:pPr>
-      <w:bookmarkStart w:id="11" w:name="_Toc211728035"/>
-      <w:r>
-        <w:t>3.2 Requirement List (FR1–FR5)</w:t>
-      </w:r>
-      <w:bookmarkEnd w:id="11"/>
-      <w:r>
-        <w:t xml:space="preserve"> </w:t>
-      </w:r>
-    </w:p>
-    <w:p>
       <w:pPr>
         <w:rPr>
           <w:i/>
@@ -3091,6 +3029,97 @@
           <w:i/>
           <w:iCs/>
         </w:rPr>
+        <w:t>List programming languages, frameworks, and tools used.</w:t>
+      </w:r>
+    </w:p>
+    <w:p>
+      <w:r>
+        <w:t>Programming languages: PHP</w:t>
+      </w:r>
+    </w:p>
+    <w:p>
+      <w:r>
+        <w:t xml:space="preserve">Frameworks: </w:t>
+      </w:r>
+      <w:r>
+        <w:t>Laravel</w:t>
+      </w:r>
+    </w:p>
+    <w:p>
+      <w:r>
+        <w:t>Database: MySQL</w:t>
+      </w:r>
+    </w:p>
+    <w:p>
+      <w:r>
+        <w:t>Query: SQL</w:t>
+      </w:r>
+    </w:p>
+    <w:p>
+      <w:r>
+        <w:pict w14:anchorId="6EDA766F">
+          <v:rect id="_x0000_i1028" style="width:0;height:1.5pt" o:hralign="center" o:hrstd="t" o:hr="t" fillcolor="#a0a0a0" stroked="f"/>
+        </w:pict>
+      </w:r>
+    </w:p>
+    <w:p>
+      <w:pPr>
+        <w:pStyle w:val="Heading1"/>
+      </w:pPr>
+      <w:bookmarkStart w:id="9" w:name="_Toc212025826"/>
+      <w:r>
+        <w:t>3. Functional Requirements</w:t>
+      </w:r>
+      <w:bookmarkEnd w:id="9"/>
+    </w:p>
+    <w:p>
+      <w:pPr>
+        <w:pStyle w:val="Heading2"/>
+      </w:pPr>
+      <w:bookmarkStart w:id="10" w:name="_Toc212025827"/>
+      <w:r>
+        <w:t>3.1 Introduction</w:t>
+      </w:r>
+      <w:bookmarkEnd w:id="10"/>
+    </w:p>
+    <w:p>
+      <w:r>
+        <w:t xml:space="preserve">Functional Requirements is based on what the system should do, This can done by the usage of features, specific actions, and behaviours so that it helps the user throughout the website. For the </w:t>
+      </w:r>
+      <w:proofErr w:type="spellStart"/>
+      <w:r>
+        <w:t>PixelPals</w:t>
+      </w:r>
+      <w:proofErr w:type="spellEnd"/>
+      <w:r>
+        <w:t xml:space="preserve"> Project, Function Requirements will make sure that system functionally will allow the users to register, sign in, placing orders and adding Parent control. Furthermore, Function Requirements will support both users and admins by providing features to manage and interact with the ecommerce website with ease .</w:t>
+      </w:r>
+    </w:p>
+    <w:p>
+      <w:pPr>
+        <w:pStyle w:val="Heading2"/>
+      </w:pPr>
+      <w:bookmarkStart w:id="11" w:name="_Toc211728035"/>
+      <w:r>
+        <w:t>3.2 Requirement List (FR1–FR5)</w:t>
+      </w:r>
+      <w:bookmarkEnd w:id="11"/>
+      <w:r>
+        <w:t xml:space="preserve"> </w:t>
+      </w:r>
+    </w:p>
+    <w:p>
+      <w:pPr>
+        <w:rPr>
+          <w:i/>
+          <w:iCs/>
+        </w:rPr>
+      </w:pPr>
+      <w:r>
+        <w:rPr>
+          <w:i/>
+          <w:iCs/>
+        </w:rPr>
         <w:t>List and describe each functional requirement (FR1, FR2, etc.).</w:t>
       </w:r>
     </w:p>
@@ -3126,6 +3155,7 @@
         <w:ind w:left="720" w:hanging="720"/>
       </w:pPr>
       <w:r>
+        <w:lastRenderedPageBreak/>
         <w:t>4.</w:t>
       </w:r>
       <w:r>
@@ -3155,7 +3185,6 @@
       </w:pPr>
       <w:bookmarkStart w:id="12" w:name="_Toc212025829"/>
       <w:r>
-        <w:lastRenderedPageBreak/>
         <w:t>4. Non-Functional Requirements</w:t>
       </w:r>
       <w:bookmarkEnd w:id="12"/>
@@ -3354,6 +3383,7 @@
       </w:pPr>
       <w:bookmarkStart w:id="23" w:name="_Toc212025840"/>
       <w:r>
+        <w:lastRenderedPageBreak/>
         <w:t>5.6 Flow Diagrams (Admin/User Journey)</w:t>
       </w:r>
       <w:bookmarkEnd w:id="23"/>
@@ -3380,7 +3410,6 @@
       </w:pPr>
       <w:bookmarkStart w:id="24" w:name="_Toc212025841"/>
       <w:r>
-        <w:lastRenderedPageBreak/>
         <w:t>6. Project Management</w:t>
       </w:r>
       <w:bookmarkEnd w:id="24"/>
@@ -3579,6 +3608,7 @@
       </w:pPr>
       <w:bookmarkStart w:id="35" w:name="_Toc212025852"/>
       <w:r>
+        <w:lastRenderedPageBreak/>
         <w:t>Appendix E – Product Grid (optional)</w:t>
       </w:r>
       <w:bookmarkEnd w:id="35"/>
@@ -3599,7 +3629,6 @@
       </w:pPr>
       <w:bookmarkStart w:id="36" w:name="_Toc212025853"/>
       <w:r>
-        <w:lastRenderedPageBreak/>
         <w:t>5.7 Site Map</w:t>
       </w:r>
       <w:bookmarkEnd w:id="36"/>

</xml_diff>